<commit_message>
add api pic and names
</commit_message>
<xml_diff>
--- a/RCE20268_Israel_Ofir_Elad_ENGLISH.docx
+++ b/RCE20268_Israel_Ofir_Elad_ENGLISH.docx
@@ -28,11 +28,11 @@
         <w:tblLook w:val="04A0" w:firstRow="1" w:lastRow="0" w:firstColumn="1" w:lastColumn="0" w:noHBand="0" w:noVBand="1"/>
       </w:tblPr>
       <w:tblGrid>
-        <w:gridCol w:w="2016"/>
-        <w:gridCol w:w="2016"/>
-        <w:gridCol w:w="2016"/>
-        <w:gridCol w:w="2016"/>
-        <w:gridCol w:w="2016"/>
+        <w:gridCol w:w="1869"/>
+        <w:gridCol w:w="1890"/>
+        <w:gridCol w:w="1934"/>
+        <w:gridCol w:w="2654"/>
+        <w:gridCol w:w="1949"/>
       </w:tblGrid>
       <w:tr>
         <w:trPr>
@@ -126,9 +126,18 @@
           <w:p>
             <w:r>
               <w:rPr>
+                <w:rFonts w:hint="cs"/>
+                <w:sz w:val="20"/>
+                <w:rtl/>
+                <w:lang w:bidi="he-IL"/>
+              </w:rPr>
+              <w:t>ישראל מהרי</w:t>
+            </w:r>
+            <w:r>
+              <w:rPr>
                 <w:sz w:val="20"/>
               </w:rPr>
-              <w:t>Israel Mahari</w:t>
+              <w:t xml:space="preserve"> </w:t>
             </w:r>
           </w:p>
         </w:tc>
@@ -142,7 +151,13 @@
               <w:rPr>
                 <w:sz w:val="20"/>
               </w:rPr>
-              <w:t>Israel Mahari</w:t>
+              <w:t xml:space="preserve">Israel </w:t>
+            </w:r>
+            <w:r>
+              <w:rPr>
+                <w:sz w:val="20"/>
+              </w:rPr>
+              <w:t>Mahari</w:t>
             </w:r>
           </w:p>
         </w:tc>
@@ -151,21 +166,60 @@
             <w:tcW w:w="2016" w:type="dxa"/>
             <w:vAlign w:val="center"/>
           </w:tcPr>
-          <w:p/>
+          <w:p>
+            <w:r>
+              <w:t>316583798</w:t>
+            </w:r>
+          </w:p>
         </w:tc>
         <w:tc>
           <w:tcPr>
             <w:tcW w:w="2016" w:type="dxa"/>
             <w:vAlign w:val="center"/>
           </w:tcPr>
-          <w:p/>
+          <w:p>
+            <w:r>
+              <w:rPr>
+                <w:sz w:val="20"/>
+              </w:rPr>
+              <w:t>I</w:t>
+            </w:r>
+            <w:r>
+              <w:rPr>
+                <w:sz w:val="20"/>
+              </w:rPr>
+              <w:t>srae</w:t>
+            </w:r>
+            <w:r>
+              <w:rPr>
+                <w:sz w:val="20"/>
+              </w:rPr>
+              <w:t>lm</w:t>
+            </w:r>
+            <w:r>
+              <w:rPr>
+                <w:sz w:val="20"/>
+              </w:rPr>
+              <w:t>ahari</w:t>
+            </w:r>
+            <w:r>
+              <w:rPr>
+                <w:sz w:val="20"/>
+              </w:rPr>
+              <w:t>00@gmail.com</w:t>
+            </w:r>
+          </w:p>
         </w:tc>
         <w:tc>
           <w:tcPr>
             <w:tcW w:w="2016" w:type="dxa"/>
             <w:vAlign w:val="center"/>
           </w:tcPr>
-          <w:p/>
+          <w:p>
+            <w:r>
+              <w:t>0526402686</w:t>
+            </w:r>
+          </w:p>
         </w:tc>
       </w:tr>
       <w:tr>
@@ -178,11 +232,20 @@
             <w:vAlign w:val="center"/>
           </w:tcPr>
           <w:p>
+            <w:pPr>
+              <w:rPr>
+                <w:rFonts w:hint="cs"/>
+                <w:lang w:bidi="he-IL"/>
+              </w:rPr>
+            </w:pPr>
             <w:r>
               <w:rPr>
+                <w:rFonts w:hint="cs"/>
                 <w:sz w:val="20"/>
+                <w:rtl/>
+                <w:lang w:bidi="he-IL"/>
               </w:rPr>
-              <w:t>Ofir</w:t>
+              <w:t>אופיר זוהר</w:t>
             </w:r>
           </w:p>
         </w:tc>
@@ -198,6 +261,18 @@
               </w:rPr>
               <w:t>Ofir</w:t>
             </w:r>
+            <w:r>
+              <w:rPr>
+                <w:sz w:val="20"/>
+              </w:rPr>
+              <w:t xml:space="preserve"> </w:t>
+            </w:r>
+            <w:r>
+              <w:rPr>
+                <w:sz w:val="20"/>
+              </w:rPr>
+              <w:t>Zohar</w:t>
+            </w:r>
           </w:p>
         </w:tc>
         <w:tc>
@@ -205,21 +280,44 @@
             <w:tcW w:w="2016" w:type="dxa"/>
             <w:vAlign w:val="center"/>
           </w:tcPr>
-          <w:p/>
+          <w:p>
+            <w:pPr>
+              <w:rPr>
+                <w:rFonts w:hint="cs"/>
+                <w:lang w:bidi="he-IL"/>
+              </w:rPr>
+            </w:pPr>
+            <w:r>
+              <w:rPr>
+                <w:rFonts w:hint="cs"/>
+                <w:rtl/>
+                <w:lang w:bidi="he-IL"/>
+              </w:rPr>
+              <w:t>318642980</w:t>
+            </w:r>
+          </w:p>
         </w:tc>
         <w:tc>
           <w:tcPr>
             <w:tcW w:w="2016" w:type="dxa"/>
             <w:vAlign w:val="center"/>
           </w:tcPr>
-          <w:p/>
+          <w:p>
+            <w:r>
+              <w:t>Ofirzohar11@gmail.com</w:t>
+            </w:r>
+          </w:p>
         </w:tc>
         <w:tc>
           <w:tcPr>
             <w:tcW w:w="2016" w:type="dxa"/>
             <w:vAlign w:val="center"/>
           </w:tcPr>
-          <w:p/>
+          <w:p>
+            <w:r>
+              <w:t>0505913099</w:t>
+            </w:r>
+          </w:p>
         </w:tc>
       </w:tr>
       <w:tr>
@@ -232,11 +330,20 @@
             <w:vAlign w:val="center"/>
           </w:tcPr>
           <w:p>
+            <w:pPr>
+              <w:rPr>
+                <w:rFonts w:hint="cs"/>
+                <w:lang w:bidi="he-IL"/>
+              </w:rPr>
+            </w:pPr>
             <w:r>
               <w:rPr>
+                <w:rFonts w:hint="cs"/>
                 <w:sz w:val="20"/>
+                <w:rtl/>
+                <w:lang w:bidi="he-IL"/>
               </w:rPr>
-              <w:t>Elad</w:t>
+              <w:t>אלעד חייק</w:t>
             </w:r>
           </w:p>
         </w:tc>
@@ -252,6 +359,12 @@
               </w:rPr>
               <w:t>Elad</w:t>
             </w:r>
+            <w:r>
+              <w:rPr>
+                <w:sz w:val="20"/>
+              </w:rPr>
+              <w:t xml:space="preserve"> Hayek</w:t>
+            </w:r>
           </w:p>
         </w:tc>
         <w:tc>
@@ -259,21 +372,33 @@
             <w:tcW w:w="2016" w:type="dxa"/>
             <w:vAlign w:val="center"/>
           </w:tcPr>
-          <w:p/>
+          <w:p>
+            <w:r>
+              <w:t>211873542</w:t>
+            </w:r>
+          </w:p>
         </w:tc>
         <w:tc>
           <w:tcPr>
             <w:tcW w:w="2016" w:type="dxa"/>
             <w:vAlign w:val="center"/>
           </w:tcPr>
-          <w:p/>
+          <w:p>
+            <w:r>
+              <w:t>Elad3283@gmail.com</w:t>
+            </w:r>
+          </w:p>
         </w:tc>
         <w:tc>
           <w:tcPr>
             <w:tcW w:w="2016" w:type="dxa"/>
             <w:vAlign w:val="center"/>
           </w:tcPr>
-          <w:p/>
+          <w:p>
+            <w:r>
+              <w:t>0543106916</w:t>
+            </w:r>
+          </w:p>
         </w:tc>
       </w:tr>
     </w:tbl>
@@ -322,7 +447,15 @@
         <w:spacing w:after="60"/>
       </w:pPr>
       <w:r>
-        <w:t>Malpedia, win.trickbot. A consolidated timeline, alias, actor, and publication index. Individual claims were checked against the original linked reports. https://malpedia.caad.fkie.fraunhofer.de/details/win.trickbot</w:t>
+        <w:t xml:space="preserve">Malpedia, </w:t>
+      </w:r>
+      <w:proofErr w:type="gramStart"/>
+      <w:r>
+        <w:t>win.trickbot</w:t>
+      </w:r>
+      <w:proofErr w:type="gramEnd"/>
+      <w:r>
+        <w:t>. A consolidated timeline, alias, actor, and publication index. Individual claims were checked against the original linked reports. https://malpedia.caad.fkie.fraunhofer.de/details/win.trickbot</w:t>
       </w:r>
     </w:p>
     <w:p>
@@ -387,7 +520,11 @@
         <w:spacing w:after="100"/>
       </w:pPr>
       <w:r>
-        <w:t>TrickBot is a modular malware family first observed in 2016. Its core communicates with command</w:t>
+        <w:t xml:space="preserve">TrickBot is a modular malware family first observed in 2016. Its core communicates with </w:t>
+      </w:r>
+      <w:proofErr w:type="gramStart"/>
+      <w:r>
+        <w:t>command</w:t>
       </w:r>
       <w:r>
         <w:rPr>
@@ -409,7 +546,11 @@
         <w:t xml:space="preserve"> </w:t>
       </w:r>
       <w:r>
-        <w:t>control servers, receives configuration data, and downloads additional modules according to the selected target. It should not be classified as fully fileless: its campaigns used local files and services as well as in</w:t>
+        <w:t>control</w:t>
+      </w:r>
+      <w:proofErr w:type="gramEnd"/>
+      <w:r>
+        <w:t xml:space="preserve"> servers, receives configuration data, and downloads additional modules according to the selected target. It should not be classified as fully fileless: its campaigns used local files and services as well as in</w:t>
       </w:r>
       <w:r>
         <w:rPr>
@@ -437,7 +578,15 @@
         <w:spacing w:after="60"/>
       </w:pPr>
       <w:r>
-        <w:t>injectDll: injects code into browser processes and implements WebInject functionality for stealing banking credentials.</w:t>
+        <w:t xml:space="preserve">injectDll: injects code into browser processes and </w:t>
+      </w:r>
+      <w:proofErr w:type="gramStart"/>
+      <w:r>
+        <w:t>implements</w:t>
+      </w:r>
+      <w:proofErr w:type="gramEnd"/>
+      <w:r>
+        <w:t xml:space="preserve"> WebInject functionality for stealing banking credentials.</w:t>
       </w:r>
     </w:p>
     <w:p>
@@ -471,7 +620,11 @@
         <w:spacing w:after="100"/>
       </w:pPr>
       <w:r>
-        <w:t>Initial access commonly involved malicious attachments or links in phishing campaigns. TrickBot was also installed as a secondary payload on systems previously infected by Emotet. Its initial access was not generally based on a TrickBot zero</w:t>
+        <w:t xml:space="preserve">Initial access commonly involved malicious attachments or links in phishing campaigns. TrickBot was also installed as a secondary payload on systems previously infected by Emotet. Its initial access was not generally based on a TrickBot </w:t>
+      </w:r>
+      <w:proofErr w:type="gramStart"/>
+      <w:r>
+        <w:t>zero</w:t>
       </w:r>
       <w:r>
         <w:rPr>
@@ -482,7 +635,11 @@
         <w:t xml:space="preserve"> </w:t>
       </w:r>
       <w:r>
-        <w:t>day vulnerability.</w:t>
+        <w:t>day</w:t>
+      </w:r>
+      <w:proofErr w:type="gramEnd"/>
+      <w:r>
+        <w:t xml:space="preserve"> vulnerability.</w:t>
       </w:r>
     </w:p>
     <w:p>
@@ -513,7 +670,11 @@
         <w:spacing w:after="100"/>
       </w:pPr>
       <w:r>
-        <w:t>Cryptography and APIs: different versions used Windows CryptoAPI and later bcrypt functions for encryption and signing of command</w:t>
+        <w:t xml:space="preserve">Cryptography and APIs: different versions used Windows CryptoAPI and later bcrypt functions for encryption and signing of </w:t>
+      </w:r>
+      <w:proofErr w:type="gramStart"/>
+      <w:r>
+        <w:t>command</w:t>
       </w:r>
       <w:r>
         <w:rPr>
@@ -535,7 +696,11 @@
         <w:t xml:space="preserve"> </w:t>
       </w:r>
       <w:r>
-        <w:t>control traffic. The WebInject module placed hooks inside browser processes so that data could be observed or modified before TLS encryption. The exact functions varied by browser and version.</w:t>
+        <w:t>control</w:t>
+      </w:r>
+      <w:proofErr w:type="gramEnd"/>
+      <w:r>
+        <w:t xml:space="preserve"> traffic. The WebInject module placed hooks inside browser processes so that data could be observed or modified before TLS encryption. The exact functions varied by browser and version.</w:t>
       </w:r>
     </w:p>
     <w:p>
@@ -555,7 +720,15 @@
         <w:spacing w:after="100"/>
       </w:pPr>
       <w:r>
-        <w:t>API hooking and code injection: SentinelOne reported that WebInject components were injected into browser processes and hooked communication functions such as PR_Write in Firefox. This enabled interception of data before encryption and injection of content into displayed pages. MITRE also documents use of Nt* functions for injection into legitimate processes, including wermgr.exe.</w:t>
+        <w:t xml:space="preserve">API hooking and code injection: SentinelOne reported that WebInject components were injected into browser processes and hooked communication functions such as PR_Write in Firefox. This enabled interception of data before encryption and injection of content into displayed pages. MITRE also documents </w:t>
+      </w:r>
+      <w:proofErr w:type="gramStart"/>
+      <w:r>
+        <w:t>use of</w:t>
+      </w:r>
+      <w:proofErr w:type="gramEnd"/>
+      <w:r>
+        <w:t xml:space="preserve"> Nt* functions for injection into legitimate processes, including wermgr.exe.</w:t>
       </w:r>
     </w:p>
     <w:p>
@@ -571,21 +744,13 @@
         <w:spacing w:after="100"/>
       </w:pPr>
       <w:r>
-        <w:t xml:space="preserve">Obfuscation and </w:t>
-      </w:r>
-      <w:proofErr w:type="spellStart"/>
-      <w:r>
-        <w:t>anti</w:t>
+        <w:t>Obfuscation and anti</w:t>
       </w:r>
       <w:r>
         <w:t xml:space="preserve"> </w:t>
       </w:r>
       <w:r>
-        <w:t>analysis</w:t>
-      </w:r>
-      <w:proofErr w:type="spellEnd"/>
-      <w:r>
-        <w:t xml:space="preserve">: TrickBot modules and configuration data were encrypted or obfuscated and decoded at runtime. MITRE maps the family to Software Packing and Obfuscated Files or Information. It also documents timing checks and API hammering, such as repeated </w:t>
+        <w:t xml:space="preserve">analysis: TrickBot modules and configuration data were encrypted or obfuscated and decoded at runtime. MITRE maps the family to Software Packing and Obfuscated Files or Information. It also documents timing checks and API hammering, such as repeated </w:t>
       </w:r>
       <w:proofErr w:type="spellStart"/>
       <w:r>
@@ -607,7 +772,15 @@
         <w:spacing w:after="100"/>
       </w:pPr>
       <w:r>
-        <w:t>Backdoor and update behavior: the malware maintained access through regular command</w:t>
+        <w:t xml:space="preserve">Backdoor and update behavior: the </w:t>
+      </w:r>
+      <w:proofErr w:type="gramStart"/>
+      <w:r>
+        <w:t>malware maintained</w:t>
+      </w:r>
+      <w:proofErr w:type="gramEnd"/>
+      <w:r>
+        <w:t xml:space="preserve"> access through regular command</w:t>
       </w:r>
       <w:r>
         <w:t xml:space="preserve"> </w:t>
@@ -768,7 +941,15 @@
         <w:spacing w:after="100"/>
       </w:pPr>
       <w:r>
-        <w:t>Names and aliases: MITRE tracks APT41 as G0096 and lists Wicked Panda, Brass Typhoon, and BARIUM. Reporting partially overlaps with the Winnti Group label. Double Dragon appears in Mandiant reporting, but vendor taxonomies are not identical and every Winnti-labelled operation should not automatically be attributed to APT41.</w:t>
+        <w:t xml:space="preserve">Names and aliases: MITRE tracks APT41 as G0096 and lists Wicked Panda, Brass Typhoon, and BARIUM. Reporting partially overlaps with the Winnti Group label. Double Dragon appears in Mandiant reporting, but vendor taxonomies are not </w:t>
+      </w:r>
+      <w:proofErr w:type="gramStart"/>
+      <w:r>
+        <w:t>identical</w:t>
+      </w:r>
+      <w:proofErr w:type="gramEnd"/>
+      <w:r>
+        <w:t xml:space="preserve"> and every Winnti-labelled operation should not automatically be attributed to APT41.</w:t>
       </w:r>
     </w:p>
     <w:p>
@@ -943,7 +1124,15 @@
         <w:spacing w:after="100"/>
       </w:pPr>
       <w:r>
-        <w:t>Example: the SolarWinds Orion supply</w:t>
+        <w:t xml:space="preserve">Example: </w:t>
+      </w:r>
+      <w:proofErr w:type="gramStart"/>
+      <w:r>
+        <w:t>the</w:t>
+      </w:r>
+      <w:proofErr w:type="gramEnd"/>
+      <w:r>
+        <w:t xml:space="preserve"> SolarWinds Orion supply</w:t>
       </w:r>
       <w:r>
         <w:t xml:space="preserve"> </w:t>
@@ -971,7 +1160,15 @@
         <w:t xml:space="preserve"> </w:t>
       </w:r>
       <w:r>
-        <w:t>bearing updates were distributed primarily from March through June 2020. FireEye publicly disclosed the incident on December 13, 2020 after investigating an intrusion into its own network.</w:t>
+        <w:t xml:space="preserve">bearing updates were distributed primarily from March through June 2020. FireEye publicly disclosed the incident on December 13, </w:t>
+      </w:r>
+      <w:proofErr w:type="gramStart"/>
+      <w:r>
+        <w:t>2020</w:t>
+      </w:r>
+      <w:proofErr w:type="gramEnd"/>
+      <w:r>
+        <w:t xml:space="preserve"> after investigating an intrusion into its own network.</w:t>
       </w:r>
     </w:p>
     <w:p>
@@ -991,7 +1188,15 @@
         <w:t>.</w:t>
       </w:r>
       <w:r>
-        <w:t xml:space="preserve"> the attackers selected a much smaller subset.</w:t>
+        <w:t xml:space="preserve"> </w:t>
+      </w:r>
+      <w:proofErr w:type="gramStart"/>
+      <w:r>
+        <w:t>the</w:t>
+      </w:r>
+      <w:proofErr w:type="gramEnd"/>
+      <w:r>
+        <w:t xml:space="preserve"> attackers selected a much smaller subset.</w:t>
       </w:r>
     </w:p>
     <w:p>
@@ -999,7 +1204,11 @@
         <w:spacing w:after="100"/>
       </w:pPr>
       <w:r>
-        <w:t>Technical behavior: SUNBURST delayed execution, collected environmental information, checked for conditions intended to avoid unwanted systems, and communicated with command</w:t>
+        <w:t xml:space="preserve">Technical behavior: SUNBURST delayed execution, collected environmental information, checked for conditions intended to avoid unwanted systems, and communicated with </w:t>
+      </w:r>
+      <w:proofErr w:type="gramStart"/>
+      <w:r>
+        <w:t>command</w:t>
       </w:r>
       <w:r>
         <w:t xml:space="preserve"> </w:t>
@@ -1011,7 +1220,11 @@
         <w:t xml:space="preserve"> </w:t>
       </w:r>
       <w:r>
-        <w:t>control infrastructure using disguised traffic. Additional payloads were delivered to selected targets. https://cloud.google.com/blog/topics/threat-intelligence/evasive-attacker-leverages-solarwinds-supply-chain-compromises-with-sunburst-backdoor</w:t>
+        <w:t>control</w:t>
+      </w:r>
+      <w:proofErr w:type="gramEnd"/>
+      <w:r>
+        <w:t xml:space="preserve"> infrastructure using disguised traffic. Additional payloads were delivered to selected targets. https://cloud.google.com/blog/topics/threat-intelligence/evasive-attacker-leverages-solarwinds-supply-chain-compromises-with-sunburst-backdoor</w:t>
       </w:r>
     </w:p>
     <w:p>
@@ -1037,13 +1250,29 @@
         <w:t xml:space="preserve"> </w:t>
       </w:r>
       <w:r>
-        <w:t>access trojan written for the .NET environment. Its capabilities include keylogging, file transfer, screenshots, remote camera and microphone access, password theft, and plugin</w:t>
+        <w:t xml:space="preserve">access trojan written for the .NET environment. Its capabilities include keylogging, file transfer, screenshots, remote camera and microphone access, password theft, and </w:t>
+      </w:r>
+      <w:proofErr w:type="gramStart"/>
+      <w:r>
+        <w:t>plugin</w:t>
       </w:r>
       <w:r>
         <w:t xml:space="preserve"> </w:t>
       </w:r>
       <w:r>
-        <w:t>based extension. Leaked and cracked versions increased its availability to criminal and state</w:t>
+        <w:t>based</w:t>
+      </w:r>
+      <w:proofErr w:type="gramEnd"/>
+      <w:r>
+        <w:t xml:space="preserve"> extension. Leaked and cracked versions increased </w:t>
+      </w:r>
+      <w:proofErr w:type="gramStart"/>
+      <w:r>
+        <w:t>its</w:t>
+      </w:r>
+      <w:proofErr w:type="gramEnd"/>
+      <w:r>
+        <w:t xml:space="preserve"> availability to criminal and state</w:t>
       </w:r>
       <w:r>
         <w:t xml:space="preserve"> </w:t>
@@ -1104,7 +1333,15 @@
       </w:r>
       <w:proofErr w:type="spellEnd"/>
       <w:r>
-        <w:t xml:space="preserve"> operators maintained target</w:t>
+        <w:t xml:space="preserve"> </w:t>
+      </w:r>
+      <w:proofErr w:type="gramStart"/>
+      <w:r>
+        <w:t>operators maintained</w:t>
+      </w:r>
+      <w:proofErr w:type="gramEnd"/>
+      <w:r>
+        <w:t xml:space="preserve"> target</w:t>
       </w:r>
       <w:r>
         <w:t xml:space="preserve"> </w:t>
@@ -1279,15 +1516,11 @@
         <w:jc w:val="center"/>
       </w:pPr>
       <w:r>
-        <w:rPr>
-          <w:noProof/>
-        </w:rPr>
-        <w:lastRenderedPageBreak/>
         <w:drawing>
-          <wp:inline distT="0" distB="0" distL="0" distR="0" wp14:anchorId="786C4291" wp14:editId="6C429EB2">
-            <wp:extent cx="5212080" cy="8562703"/>
+          <wp:inline distT="0" distB="0" distL="0" distR="0" wp14:anchorId="77254C0B" wp14:editId="5E603068">
+            <wp:extent cx="5624213" cy="6446016"/>
             <wp:effectExtent l="0" t="0" r="0" b="0"/>
-            <wp:docPr id="1" name="Picture 1"/>
+            <wp:docPr id="848443119" name="Picture 1"/>
             <wp:cNvGraphicFramePr>
               <a:graphicFrameLocks xmlns:a="http://schemas.openxmlformats.org/drawingml/2006/main" noChangeAspect="1"/>
             </wp:cNvGraphicFramePr>
@@ -1295,7 +1528,7 @@
               <a:graphicData uri="http://schemas.openxmlformats.org/drawingml/2006/picture">
                 <pic:pic xmlns:pic="http://schemas.openxmlformats.org/drawingml/2006/picture">
                   <pic:nvPicPr>
-                    <pic:cNvPr id="0" name="AI_01_Codex_APT41.png"/>
+                    <pic:cNvPr id="848443119" name=""/>
                     <pic:cNvPicPr/>
                   </pic:nvPicPr>
                   <pic:blipFill>
@@ -1307,7 +1540,7 @@
                   <pic:spPr>
                     <a:xfrm>
                       <a:off x="0" y="0"/>
-                      <a:ext cx="5212080" cy="8562703"/>
+                      <a:ext cx="5626957" cy="6449161"/>
                     </a:xfrm>
                     <a:prstGeom prst="rect">
                       <a:avLst/>
@@ -1323,6 +1556,15 @@
     <w:p>
       <w:pPr>
         <w:spacing w:before="200" w:after="100"/>
+        <w:rPr>
+          <w:b/>
+          <w:sz w:val="26"/>
+        </w:rPr>
+      </w:pPr>
+    </w:p>
+    <w:p>
+      <w:pPr>
+        <w:spacing w:before="200" w:after="100"/>
       </w:pPr>
       <w:r>
         <w:rPr>
@@ -1370,23 +1612,32 @@
         <w:spacing w:after="100"/>
       </w:pPr>
       <w:r>
-        <w:t>The SolarWinds incident compromised the software build environment, allowing SUNBURST to be incorporated into an Orion DLL, digitally signed, and distributed through the legitimate update channel. Preparatory activity began in 2019, and affected updates were distributed primarily between March and June 2020. FireEye publicly disclosed the incident on December 13, 2020. Approximately 18,000 customers downloaded a potentially affected update, but only a smaller subset received follow-on exploitation. SUNBURST used delayed execution, environment checks, and disguised command-and-control traffic before delivering additional payloads to selected targets. Source: https://cloud.google.com/blog/topics/threat-intelligence/evasive-attacker-leverages-solarwinds-supply-chain-compromises-with-sunburst-backdoor</w:t>
-      </w:r>
+        <w:t xml:space="preserve">The SolarWinds incident compromised the software build environment, allowing SUNBURST to be incorporated into an Orion DLL, digitally signed, and distributed through the legitimate update channel. Preparatory activity began in 2019, and affected updates were distributed primarily between March and June 2020. FireEye publicly disclosed the incident on December 13, 2020. Approximately 18,000 customers downloaded a potentially affected update, but only a smaller subset received follow-on exploitation. SUNBURST used delayed execution, environment checks, and disguised command-and-control traffic before delivering additional payloads to selected targets. Source: </w:t>
+      </w:r>
+      <w:hyperlink r:id="rId7" w:history="1">
+        <w:r>
+          <w:rPr>
+            <w:rStyle w:val="Hyperlink"/>
+          </w:rPr>
+          <w:t>https://cloud.google.com/blog/topics/threat-intelligence/evasive-attacker-leverages-solarwinds-supply-chain-compromises-with-sunburst-backdoor</w:t>
+        </w:r>
+      </w:hyperlink>
     </w:p>
     <w:p>
       <w:pPr>
-        <w:jc w:val="center"/>
-      </w:pPr>
-      <w:r>
-        <w:rPr>
-          <w:noProof/>
-        </w:rPr>
-        <w:lastRenderedPageBreak/>
+        <w:spacing w:after="100"/>
+      </w:pPr>
+    </w:p>
+    <w:p>
+      <w:pPr>
+        <w:spacing w:after="100"/>
+      </w:pPr>
+      <w:r>
         <w:drawing>
-          <wp:inline distT="0" distB="0" distL="0" distR="0" wp14:anchorId="52CF13C4" wp14:editId="6D361ED7">
-            <wp:extent cx="5212080" cy="8562703"/>
-            <wp:effectExtent l="0" t="0" r="0" b="0"/>
-            <wp:docPr id="2" name="Picture 2"/>
+          <wp:inline distT="0" distB="0" distL="0" distR="0" wp14:anchorId="025D0064" wp14:editId="627F004F">
+            <wp:extent cx="4624855" cy="4473446"/>
+            <wp:effectExtent l="0" t="0" r="4445" b="3810"/>
+            <wp:docPr id="1884113657" name="Picture 1"/>
             <wp:cNvGraphicFramePr>
               <a:graphicFrameLocks xmlns:a="http://schemas.openxmlformats.org/drawingml/2006/main" noChangeAspect="1"/>
             </wp:cNvGraphicFramePr>
@@ -1394,11 +1645,11 @@
               <a:graphicData uri="http://schemas.openxmlformats.org/drawingml/2006/picture">
                 <pic:pic xmlns:pic="http://schemas.openxmlformats.org/drawingml/2006/picture">
                   <pic:nvPicPr>
-                    <pic:cNvPr id="0" name="AI_02_Codex_SolarWinds.png"/>
+                    <pic:cNvPr id="1884113657" name=""/>
                     <pic:cNvPicPr/>
                   </pic:nvPicPr>
                   <pic:blipFill>
-                    <a:blip r:embed="rId7"/>
+                    <a:blip r:embed="rId8"/>
                     <a:stretch>
                       <a:fillRect/>
                     </a:stretch>
@@ -1406,7 +1657,7 @@
                   <pic:spPr>
                     <a:xfrm>
                       <a:off x="0" y="0"/>
-                      <a:ext cx="5212080" cy="8562703"/>
+                      <a:ext cx="4645776" cy="4493682"/>
                     </a:xfrm>
                     <a:prstGeom prst="rect">
                       <a:avLst/>
@@ -1421,6 +1672,20 @@
     </w:p>
     <w:p>
       <w:pPr>
+        <w:jc w:val="center"/>
+      </w:pPr>
+    </w:p>
+    <w:p>
+      <w:pPr>
+        <w:spacing w:before="200" w:after="100"/>
+        <w:rPr>
+          <w:b/>
+          <w:sz w:val="26"/>
+        </w:rPr>
+      </w:pPr>
+    </w:p>
+    <w:p>
+      <w:pPr>
         <w:spacing w:before="200" w:after="100"/>
       </w:pPr>
       <w:r>
@@ -1449,7 +1714,15 @@
         <w:t xml:space="preserve"> </w:t>
       </w:r>
       <w:r>
-        <w:t>click compromise, sandbox escape, and spyware deployment depended on multiple vulnerabilities rather than this CVE alone. Apple fixed it in iOS and iPadOS 16.5.1 and corresponding platform releases. The spyware primarily operated in memory and did not maintain conventional persistence across reboot. Sources: https://support.apple.com/en-us/102162 and https://www.kaspersky.com/blog/triangulation-attack-on-ios/48353/</w:t>
+        <w:t xml:space="preserve">click compromise, sandbox escape, and spyware deployment depended on multiple vulnerabilities rather than this CVE alone. Apple fixed it in iOS and iPadOS 16.5.1 and corresponding platform releases. The spyware primarily operated in memory and did not maintain conventional persistence across </w:t>
+      </w:r>
+      <w:proofErr w:type="gramStart"/>
+      <w:r>
+        <w:t>reboot</w:t>
+      </w:r>
+      <w:proofErr w:type="gramEnd"/>
+      <w:r>
+        <w:t>. Sources: https://support.apple.com/en-us/102162 and https://www.kaspersky.com/blog/triangulation-attack-on-ios/48353/</w:t>
       </w:r>
     </w:p>
     <w:p>
@@ -1469,7 +1742,15 @@
         <w:spacing w:after="100"/>
       </w:pPr>
       <w:r>
-        <w:t>Registry Run Keys / Startup Folder - T1547.001. Malware adds a value under a location such as HKCU\Software\Microsoft\Windows\CurrentVersion\Run. Windows launches the configured payload when the user logs in, allowing the attacker to retain access across restarts. https://attack.mitre.org/techniques/T1547/001/</w:t>
+        <w:t xml:space="preserve">Registry Run Keys / Startup Folder - T1547.001. Malware adds </w:t>
+      </w:r>
+      <w:proofErr w:type="gramStart"/>
+      <w:r>
+        <w:t>a value</w:t>
+      </w:r>
+      <w:proofErr w:type="gramEnd"/>
+      <w:r>
+        <w:t xml:space="preserve"> under a location such as HKCU\Software\Microsoft\Windows\CurrentVersion\Run. Windows launches the configured payload when the user logs in, allowing the attacker to retain access across restarts. https://attack.mitre.org/techniques/T1547/001/</w:t>
       </w:r>
     </w:p>
     <w:p>
@@ -1529,7 +1810,11 @@
         <w:spacing w:after="100"/>
       </w:pPr>
       <w:r>
-        <w:t>Exfiltration Over C2 Channel - T1041. Stolen documents, credentials, or database content are transmitted through the command</w:t>
+        <w:t xml:space="preserve">Exfiltration Over C2 Channel - T1041. Stolen documents, credentials, or database content are transmitted through the </w:t>
+      </w:r>
+      <w:proofErr w:type="gramStart"/>
+      <w:r>
+        <w:t>command</w:t>
       </w:r>
       <w:r>
         <w:t xml:space="preserve"> </w:t>
@@ -1541,7 +1826,11 @@
         <w:t xml:space="preserve"> </w:t>
       </w:r>
       <w:r>
-        <w:t>control channel already used by the malware. Reusing an existing HTTP, HTTPS, or other disguised channel avoids creating a separate, easily identified exfiltration connection. https://attack.mitre.org/techniques/T1041/</w:t>
+        <w:t>control</w:t>
+      </w:r>
+      <w:proofErr w:type="gramEnd"/>
+      <w:r>
+        <w:t xml:space="preserve"> channel already used by the malware. Reusing an existing HTTP, HTTPS, or other disguised channel avoids creating a separate, easily identified exfiltration connection. https://attack.mitre.org/techniques/T1041/</w:t>
       </w:r>
     </w:p>
     <w:p>
@@ -1655,21 +1944,13 @@
         <w:t xml:space="preserve"> </w:t>
       </w:r>
       <w:r>
-        <w:t xml:space="preserve">name hashing, and </w:t>
-      </w:r>
-      <w:proofErr w:type="spellStart"/>
-      <w:r>
-        <w:t>anti</w:t>
+        <w:t>name hashing, and anti</w:t>
       </w:r>
       <w:r>
         <w:t xml:space="preserve"> </w:t>
       </w:r>
       <w:r>
-        <w:t>analysis</w:t>
-      </w:r>
-      <w:proofErr w:type="spellEnd"/>
-      <w:r>
-        <w:t xml:space="preserve"> logic.</w:t>
+        <w:t>analysis logic.</w:t>
       </w:r>
     </w:p>
     <w:p>
@@ -1683,6 +1964,11 @@
     <w:p>
       <w:pPr>
         <w:spacing w:after="100"/>
+        <w:rPr>
+          <w:rFonts w:hint="cs"/>
+          <w:rtl/>
+          <w:lang w:bidi="he-IL"/>
+        </w:rPr>
       </w:pPr>
       <w:r>
         <w:t>Source</w:t>
@@ -1707,21 +1993,13 @@
         <w:spacing w:after="100"/>
       </w:pPr>
       <w:r>
-        <w:t xml:space="preserve">The researchers analyzed code structure and flow, API hashing, dynamic loading, </w:t>
-      </w:r>
-      <w:proofErr w:type="spellStart"/>
-      <w:r>
-        <w:t>anti</w:t>
+        <w:t>The researchers analyzed code structure and flow, API hashing, dynamic loading, anti</w:t>
       </w:r>
       <w:r>
         <w:t xml:space="preserve"> </w:t>
       </w:r>
       <w:r>
-        <w:t>hook</w:t>
-      </w:r>
-      <w:proofErr w:type="spellEnd"/>
-      <w:r>
-        <w:t xml:space="preserve"> mechanisms, command</w:t>
+        <w:t>hook mechanisms, command</w:t>
       </w:r>
       <w:r>
         <w:t xml:space="preserve"> </w:t>
@@ -13412,6 +13690,29 @@
       </w:tcPr>
     </w:tblStylePr>
   </w:style>
+  <w:style w:type="character" w:styleId="Hyperlink">
+    <w:name w:val="Hyperlink"/>
+    <w:basedOn w:val="DefaultParagraphFont"/>
+    <w:uiPriority w:val="99"/>
+    <w:unhideWhenUsed/>
+    <w:rsid w:val="00A16D32"/>
+    <w:rPr>
+      <w:color w:val="0000FF" w:themeColor="hyperlink"/>
+      <w:u w:val="single"/>
+    </w:rPr>
+  </w:style>
+  <w:style w:type="character" w:styleId="UnresolvedMention">
+    <w:name w:val="Unresolved Mention"/>
+    <w:basedOn w:val="DefaultParagraphFont"/>
+    <w:uiPriority w:val="99"/>
+    <w:semiHidden/>
+    <w:unhideWhenUsed/>
+    <w:rsid w:val="00A16D32"/>
+    <w:rPr>
+      <w:color w:val="605E5C"/>
+      <w:shd w:val="clear" w:color="auto" w:fill="E1DFDD"/>
+    </w:rPr>
+  </w:style>
 </w:styles>
 </file>
 

</xml_diff>